<commit_message>
Session 8: book benchmarking, industry norms, proposal-note check
All three run on nothing but what the desk officer already has:
- analytics/benchmark.py: every ingested borrower becomes a peer —
  percentile positioning on margins/growth/liquidity/leverage/DSO
  vs same-industry peers (whole book while thin), plus a maintained
  industry_norm table for sector medians from public rating notes;
  memo gains a peer-positioning table; GET /benchmark
- report/note_check.py: traces every figure in the analyst s .docx
  appraisal note to the CMA data at the precision the note quotes
  (2dp must match to +/-0.005); dates, identifiers and code-like
  integers skipped; validated on a real appraisal note — financial
  figures traced, facility limits correctly surfaced as
  verification items; POST /notecheck
- CLI: benchmark / industry / norms / notecheck commands; guide
  updated (steps 8-9 + command reference); 7 new tests (117 total)

Co-Authored-By: Claude Fable 5 <noreply@anthropic.com>
</commit_message>
<xml_diff>
--- a/docs/CMA_Analyser_User_Guide.docx
+++ b/docs/CMA_Analyser_User_Guide.docx
@@ -545,6 +545,138 @@
     <w:p>
       <w:r>
         <w:t>afterwards to include the narrative in section 8.</w:t>
+      </w:r>
+    </w:p>
+    <w:p>
+      <w:pPr>
+        <w:pStyle w:val="Heading2"/>
+      </w:pPr>
+      <w:r>
+        <w:t>Step 8 — Check the analyst's proposal note</w:t>
+      </w:r>
+    </w:p>
+    <w:p>
+      <w:r>
+        <w:t>If you receive the analyst's appraisal note as a .docx, trace every</w:t>
+      </w:r>
+    </w:p>
+    <w:p>
+      <w:r>
+        <w:t>figure in it back to the CMA data:</w:t>
+      </w:r>
+    </w:p>
+    <w:p>
+      <w:r>
+        <w:rPr>
+          <w:rFonts w:ascii="Consolas" w:hAnsi="Consolas"/>
+          <w:color w:val="1F3B57"/>
+          <w:sz w:val="17"/>
+        </w:rPr>
+        <w:t>.\venv\Scripts\python.exe cma.py notecheck "D:\Work\&lt;note&gt;.docx" -b "WINTAS TEXTILES"</w:t>
+      </w:r>
+    </w:p>
+    <w:p>
+      <w:r>
+        <w:t>Figures that trace are confirmed; the rest are listed with their</w:t>
+      </w:r>
+    </w:p>
+    <w:p>
+      <w:r>
+        <w:t xml:space="preserve">surrounding sentence as </w:t>
+      </w:r>
+      <w:r>
+        <w:rPr>
+          <w:b/>
+        </w:rPr>
+        <w:t>verification items</w:t>
+      </w:r>
+      <w:r>
+        <w:t xml:space="preserve"> — typically facility</w:t>
+      </w:r>
+    </w:p>
+    <w:p>
+      <w:r>
+        <w:t>limits and sanction terms (check those against the sanction documents)</w:t>
+      </w:r>
+    </w:p>
+    <w:p>
+      <w:r>
+        <w:t>or, occasionally, a number that exists nowhere. Dates, identifiers and</w:t>
+      </w:r>
+    </w:p>
+    <w:p>
+      <w:r>
+        <w:t>codes are skipped automatically.</w:t>
+      </w:r>
+    </w:p>
+    <w:p>
+      <w:pPr>
+        <w:pStyle w:val="Heading2"/>
+      </w:pPr>
+      <w:r>
+        <w:t>Step 9 — Benchmark against your own book</w:t>
+      </w:r>
+    </w:p>
+    <w:p>
+      <w:r>
+        <w:t>Every borrower you ingest becomes a peer. Tag industries once, then:</w:t>
+      </w:r>
+    </w:p>
+    <w:p>
+      <w:r>
+        <w:rPr>
+          <w:rFonts w:ascii="Consolas" w:hAnsi="Consolas"/>
+          <w:color w:val="1F3B57"/>
+          <w:sz w:val="17"/>
+        </w:rPr>
+        <w:t>.\venv\Scripts\python.exe cma.py industry "WINTAS TEXTILES" "Textiles"</w:t>
+        <w:br/>
+        <w:t>.\venv\Scripts\python.exe cma.py benchmark -b "WINTAS TEXTILES"</w:t>
+      </w:r>
+    </w:p>
+    <w:p>
+      <w:r>
+        <w:t>The borrower is placed at a percentile among same-industry peers (whole</w:t>
+      </w:r>
+    </w:p>
+    <w:p>
+      <w:r>
+        <w:t>book while an industry is thin) on margins, growth, liquidity, leverage</w:t>
+      </w:r>
+    </w:p>
+    <w:p>
+      <w:r>
+        <w:t>and DSO. Maintain sector medians from public rating-agency notes for an</w:t>
+      </w:r>
+    </w:p>
+    <w:p>
+      <w:r>
+        <w:t>external yardstick — they appear alongside automatically:</w:t>
+      </w:r>
+    </w:p>
+    <w:p>
+      <w:r>
+        <w:rPr>
+          <w:rFonts w:ascii="Consolas" w:hAnsi="Consolas"/>
+          <w:color w:val="1F3B57"/>
+          <w:sz w:val="17"/>
+        </w:rPr>
+        <w:t>.\venv\Scripts\python.exe cma.py norms "Textiles" --set ebitda_margin=0.075 current_ratio=1.25 tol_tnw=2.0 --source "CRISIL Apr 2026"</w:t>
+      </w:r>
+    </w:p>
+    <w:p>
+      <w:r>
+        <w:t>The comparison sharpens with every proposal you process — and once ten</w:t>
+      </w:r>
+    </w:p>
+    <w:p>
+      <w:r>
+        <w:t>borrower-years accumulate, the multivariate anomaly detector</w:t>
+      </w:r>
+    </w:p>
+    <w:p>
+      <w:r>
+        <w:t>(IsolationForest) activates on its own.</w:t>
       </w:r>
     </w:p>
     <w:p>
@@ -1470,6 +1602,20 @@
         <w:br/>
         <w:t>cma.py committee [-b NAME]           4-agent AI narrative (Ollama)</w:t>
         <w:br/>
+        <w:t>cma.py benchmark [-b NAME]           borrower vs the book + industry norms</w:t>
+        <w:br/>
+        <w:t>cma.py industry NAME INDUSTRY        tag a borrower's industry</w:t>
+        <w:br/>
+        <w:t>cma.py norms INDUSTRY --set METRIC=VALUE ... [--source SRC]</w:t>
+        <w:br/>
+        <w:t xml:space="preserve">                                     maintain sector medians</w:t>
+        <w:br/>
+        <w:t xml:space="preserve">                                     metrics: ebitda_margin pat_margin</w:t>
+        <w:br/>
+        <w:t xml:space="preserve">                                     sales_growth current_ratio tol_tnw dso</w:t>
+        <w:br/>
+        <w:t>cma.py notecheck PATH [-b NAME]      trace an analyst note's figures to CMA</w:t>
+        <w:br/>
         <w:t>cma.py serve                         REST API at 127.0.0.1:8000</w:t>
         <w:br/>
         <w:t>cma.py demo                          synthetic end-to-end demo</w:t>

</xml_diff>

<commit_message>
Remove proposal-note check module
The analyst proposal note cannot leave the bank environment, so the
module has no permissible input on this machine. Removed
src/report/note_check.py, the notecheck CLI command, POST /notecheck,
its tests and guide section. Division of labour: the tool owns the
quantitative case from LLMS financials; the officer handles
qualitative review offline (registry findings and EWS observations
can still be recorded via cma.py registry / the EWS manual triggers).

114 tests.

Co-Authored-By: Claude Fable 5 <noreply@anthropic.com>
</commit_message>
<xml_diff>
--- a/docs/CMA_Analyser_User_Guide.docx
+++ b/docs/CMA_Analyser_User_Guide.docx
@@ -552,69 +552,7 @@
         <w:pStyle w:val="Heading2"/>
       </w:pPr>
       <w:r>
-        <w:t>Step 8 — Check the analyst's proposal note</w:t>
-      </w:r>
-    </w:p>
-    <w:p>
-      <w:r>
-        <w:t>If you receive the analyst's appraisal note as a .docx, trace every</w:t>
-      </w:r>
-    </w:p>
-    <w:p>
-      <w:r>
-        <w:t>figure in it back to the CMA data:</w:t>
-      </w:r>
-    </w:p>
-    <w:p>
-      <w:r>
-        <w:rPr>
-          <w:rFonts w:ascii="Consolas" w:hAnsi="Consolas"/>
-          <w:color w:val="1F3B57"/>
-          <w:sz w:val="17"/>
-        </w:rPr>
-        <w:t>.\venv\Scripts\python.exe cma.py notecheck "D:\Work\&lt;note&gt;.docx" -b "WINTAS TEXTILES"</w:t>
-      </w:r>
-    </w:p>
-    <w:p>
-      <w:r>
-        <w:t>Figures that trace are confirmed; the rest are listed with their</w:t>
-      </w:r>
-    </w:p>
-    <w:p>
-      <w:r>
-        <w:t xml:space="preserve">surrounding sentence as </w:t>
-      </w:r>
-      <w:r>
-        <w:rPr>
-          <w:b/>
-        </w:rPr>
-        <w:t>verification items</w:t>
-      </w:r>
-      <w:r>
-        <w:t xml:space="preserve"> — typically facility</w:t>
-      </w:r>
-    </w:p>
-    <w:p>
-      <w:r>
-        <w:t>limits and sanction terms (check those against the sanction documents)</w:t>
-      </w:r>
-    </w:p>
-    <w:p>
-      <w:r>
-        <w:t>or, occasionally, a number that exists nowhere. Dates, identifiers and</w:t>
-      </w:r>
-    </w:p>
-    <w:p>
-      <w:r>
-        <w:t>codes are skipped automatically.</w:t>
-      </w:r>
-    </w:p>
-    <w:p>
-      <w:pPr>
-        <w:pStyle w:val="Heading2"/>
-      </w:pPr>
-      <w:r>
-        <w:t>Step 9 — Benchmark against your own book</w:t>
+        <w:t>Step 8 — Benchmark against your own book</w:t>
       </w:r>
     </w:p>
     <w:p>
@@ -1614,8 +1552,6 @@
         <w:br/>
         <w:t xml:space="preserve">                                     sales_growth current_ratio tol_tnw dso</w:t>
         <w:br/>
-        <w:t>cma.py notecheck PATH [-b NAME]      trace an analyst note's figures to CMA</w:t>
-        <w:br/>
         <w:t>cma.py serve                         REST API at 127.0.0.1:8000</w:t>
         <w:br/>
         <w:t>cma.py demo                          synthetic end-to-end demo</w:t>

</xml_diff>

<commit_message>
Session 9: loan-manual knowledge base (local FTS + RAG)
data/loan_manual.py indexes the bank Manual on Loans & Advances
(markdown export) into SQLite FTS5 (porter stemming, chapter-aware
chunks, ~1.9k passages) and answers questions with the local Ollama
model strictly from retrieved extracts, with chapter citations and an
explicit refusal when the extracts do not cover the question.
Retrieval: bm25 candidates re-ranked by distinct-term coverage.

cma.py manual command (--index / --find / --refs / -k). The manual
text lives only in the git-ignored local database — never committed.
3 new tests (122 total). Validated live against the real SBI manual.

Co-Authored-By: Claude Fable 5 <noreply@anthropic.com>
</commit_message>
<xml_diff>
--- a/docs/CMA_Analyser_User_Guide.docx
+++ b/docs/CMA_Analyser_User_Guide.docx
@@ -1552,9 +1552,102 @@
         <w:br/>
         <w:t xml:space="preserve">                                     sales_growth current_ratio tol_tnw dso</w:t>
         <w:br/>
+        <w:t>cma.py manual QUESTION...            ask the loan manual (local AI, cited)</w:t>
+        <w:br/>
+        <w:t>cma.py manual --find QUESTION...     show raw manual passages instead</w:t>
+        <w:br/>
+        <w:t>cma.py manual --index FILE.md        (re)index the manual markdown</w:t>
+        <w:br/>
         <w:t>cma.py serve                         REST API at 127.0.0.1:8000</w:t>
         <w:br/>
         <w:t>cma.py demo                          synthetic end-to-end demo</w:t>
+      </w:r>
+    </w:p>
+    <w:p>
+      <w:pPr>
+        <w:pStyle w:val="Heading1"/>
+      </w:pPr>
+      <w:r>
+        <w:t>7. The loan manual</w:t>
+      </w:r>
+    </w:p>
+    <w:p>
+      <w:r>
+        <w:t>Index the bank's Manual on Loans &amp; Advances once (markdown export):</w:t>
+      </w:r>
+    </w:p>
+    <w:p>
+      <w:r>
+        <w:rPr>
+          <w:rFonts w:ascii="Consolas" w:hAnsi="Consolas"/>
+          <w:color w:val="1F3B57"/>
+          <w:sz w:val="17"/>
+        </w:rPr>
+        <w:t>.\cma manual --index "D:\DL\loan-manual-pdf.md"</w:t>
+      </w:r>
+    </w:p>
+    <w:p>
+      <w:r>
+        <w:t>Then ask it questions in plain language — answered by the local model</w:t>
+      </w:r>
+    </w:p>
+    <w:p>
+      <w:r>
+        <w:t>strictly from the manual's own text, with chapter citations, fully</w:t>
+      </w:r>
+    </w:p>
+    <w:p>
+      <w:r>
+        <w:t>offline:</w:t>
+      </w:r>
+    </w:p>
+    <w:p>
+      <w:r>
+        <w:rPr>
+          <w:rFonts w:ascii="Consolas" w:hAnsi="Consolas"/>
+          <w:color w:val="1F3B57"/>
+          <w:sz w:val="17"/>
+        </w:rPr>
+        <w:t>.\cma manual under second method of lending how much margin must the borrower bring</w:t>
+        <w:br/>
+        <w:t>.\cma manual --find drawing power stock statement   # raw passages, no AI</w:t>
+      </w:r>
+    </w:p>
+    <w:p>
+      <w:r>
+        <w:t>If the extracts don't cover the question, it says so rather than</w:t>
+      </w:r>
+    </w:p>
+    <w:p>
+      <w:r>
+        <w:t xml:space="preserve">guessing. Add </w:t>
+      </w:r>
+      <w:r>
+        <w:rPr>
+          <w:rFonts w:ascii="Consolas" w:hAnsi="Consolas"/>
+          <w:sz w:val="18"/>
+        </w:rPr>
+        <w:t>--refs</w:t>
+      </w:r>
+      <w:r>
+        <w:t xml:space="preserve"> to see the source passages under the answer, or</w:t>
+      </w:r>
+    </w:p>
+    <w:p>
+      <w:r>
+        <w:rPr>
+          <w:rFonts w:ascii="Consolas" w:hAnsi="Consolas"/>
+          <w:sz w:val="18"/>
+        </w:rPr>
+        <w:t>-k 8</w:t>
+      </w:r>
+      <w:r>
+        <w:t xml:space="preserve"> to retrieve more. The manual's text lives only in your local</w:t>
+      </w:r>
+    </w:p>
+    <w:p>
+      <w:r>
+        <w:t>database — it is never committed to the code repository.</w:t>
       </w:r>
     </w:p>
     <w:sectPr>

</xml_diff>

<commit_message>
Probe42 downloaded-report (PDF) importer
Since the user has portal access (not an API key), the connector now
reads a report downloaded from the Probe42 site — no scraping, no
credentials in the tool. data/probe42.py parse_report_text/_pdf
(pypdf) extracts company status, open charges WITH holder names
(lenders other than SBI flagged as "who else has lent"), auditor
qualifications, legal cases, and BIFR/CDR/suit-filed/name-removal
compliance, then records the MCA registry check — adverse status /
qualified auditor / cases on record flow into EWS and committee
queries. cma probe REPORT.pdf -b NAME.

Validated on the real SBI-marked Arrowin Metaltech report (status
Active, 2 SBI charges, clean compliance -> recorded clear). Parser
split into text/PDF layers for testing; 4 new tests (128 total).
pypdf added to requirements.

Co-Authored-By: Claude Fable 5 <noreply@anthropic.com>
</commit_message>
<xml_diff>
--- a/docs/CMA_Analyser_User_Guide.docx
+++ b/docs/CMA_Analyser_User_Guide.docx
@@ -450,6 +450,91 @@
     <w:p>
       <w:r>
         <w:t>unchecked (or older than 90 days) appear in the memo as a committee query.</w:t>
+      </w:r>
+    </w:p>
+    <w:p>
+      <w:r>
+        <w:rPr>
+          <w:b/>
+        </w:rPr>
+        <w:t>Probe42 reports (MCA, automated).</w:t>
+      </w:r>
+      <w:r>
+        <w:t xml:space="preserve"> If you download a company report</w:t>
+      </w:r>
+    </w:p>
+    <w:p>
+      <w:r>
+        <w:t>from Probe42, the tool reads it directly — no manual typing for the MCA</w:t>
+      </w:r>
+    </w:p>
+    <w:p>
+      <w:r>
+        <w:t>leg:</w:t>
+      </w:r>
+    </w:p>
+    <w:p>
+      <w:r>
+        <w:rPr>
+          <w:rFonts w:ascii="Consolas" w:hAnsi="Consolas"/>
+          <w:color w:val="1F3B57"/>
+          <w:sz w:val="17"/>
+        </w:rPr>
+        <w:t>.\cma probe "D:\DL\U28999GJ2020PTC118078.pdf" -b "ARROWIN METALTECH (INDIA) PRIVATE LIMITED"</w:t>
+      </w:r>
+    </w:p>
+    <w:p>
+      <w:r>
+        <w:t xml:space="preserve">It extracts company status, open charges </w:t>
+      </w:r>
+      <w:r>
+        <w:rPr>
+          <w:b/>
+        </w:rPr>
+        <w:t>with holder names</w:t>
+      </w:r>
+      <w:r>
+        <w:t xml:space="preserve"> (so you</w:t>
+      </w:r>
+    </w:p>
+    <w:p>
+      <w:r>
+        <w:t>see who else has lent — charges held by lenders other than SBI are</w:t>
+      </w:r>
+    </w:p>
+    <w:p>
+      <w:r>
+        <w:t>flagged), auditor qualifications, legal cases, BIFR/CDR/suit-filed/</w:t>
+      </w:r>
+    </w:p>
+    <w:p>
+      <w:r>
+        <w:t>name-removal compliance, and records the MCA check automatically. An</w:t>
+      </w:r>
+    </w:p>
+    <w:p>
+      <w:r>
+        <w:t>adverse status, a qualified auditor report, or cases on record mark the</w:t>
+      </w:r>
+    </w:p>
+    <w:p>
+      <w:r>
+        <w:t xml:space="preserve">check </w:t>
+      </w:r>
+      <w:r>
+        <w:rPr>
+          <w:rFonts w:ascii="Consolas" w:hAnsi="Consolas"/>
+          <w:sz w:val="18"/>
+        </w:rPr>
+        <w:t>adverse</w:t>
+      </w:r>
+      <w:r>
+        <w:t xml:space="preserve"> → into EWS and the committee queries. (Download the</w:t>
+      </w:r>
+    </w:p>
+    <w:p>
+      <w:r>
+        <w:t>report yourself from the Probe42 portal; the tool only reads the file.)</w:t>
       </w:r>
     </w:p>
     <w:p>
@@ -1538,6 +1623,10 @@
         <w:br/>
         <w:t xml:space="preserve">                                     STATUS: clear adverse pending</w:t>
         <w:br/>
+        <w:t>cma.py probe REPORT.pdf -b NAME      import a downloaded Probe42 report</w:t>
+        <w:br/>
+        <w:t xml:space="preserve">                                     (auto-records the MCA check)</w:t>
+        <w:br/>
         <w:t>cma.py committee [-b NAME]           4-agent AI narrative (Ollama)</w:t>
         <w:br/>
         <w:t>cma.py benchmark [-b NAME]           borrower vs the book + industry norms</w:t>

</xml_diff>

<commit_message>
Add `cma backup` — timestamped DB copy to OneDrive
pipeline/backup.py uses SQLite's online backup API (consistent even
while the tool is open), defaults to OneDrive\CMA_Backups so the copy
syncs off the laptop, and prunes to the latest 14. `cma backup [--to
FOLDER]`. FIX: connections closed explicitly — `with sqlite3.connect`
commits but does not close, and the open handle blocked pruning /
deletion on Windows. 3 new tests (143 total); validated live to
OneDrive.

Co-Authored-By: Claude Fable 5 <noreply@anthropic.com>
</commit_message>
<xml_diff>
--- a/docs/CMA_Analyser_User_Guide.docx
+++ b/docs/CMA_Analyser_User_Guide.docx
@@ -1739,7 +1739,7 @@
         <w:rPr>
           <w:b/>
         </w:rPr>
-        <w:t>Data hygiene</w:t>
+        <w:t>Data hygiene &amp; backup</w:t>
       </w:r>
       <w:r>
         <w:t xml:space="preserve">: borrower data lives only in </w:t>
@@ -1761,15 +1761,79 @@
           <w:rFonts w:ascii="Consolas" w:hAnsi="Consolas"/>
           <w:sz w:val="18"/>
         </w:rPr>
-        <w:t>data\*.docx</w:t>
+        <w:t>workspace\output\*.docx</w:t>
       </w:r>
       <w:r>
-        <w:t xml:space="preserve"> on this PC — both are excluded from the code repository.</w:t>
+        <w:t xml:space="preserve"> on this PC — both are excluded from the code</w:t>
       </w:r>
     </w:p>
     <w:p>
       <w:r>
-        <w:t xml:space="preserve">Back up </w:t>
+        <w:t>repository. This database is your only copy of every ingested borrower,</w:t>
+      </w:r>
+    </w:p>
+    <w:p>
+      <w:r>
+        <w:t>registry/filing finding, news item, the manual index and the Probe cache.</w:t>
+      </w:r>
+    </w:p>
+    <w:p>
+      <w:r>
+        <w:t xml:space="preserve">Run </w:t>
+      </w:r>
+      <w:r>
+        <w:rPr>
+          <w:b/>
+        </w:rPr>
+        <w:t>`.\cma backup`</w:t>
+      </w:r>
+      <w:r>
+        <w:t xml:space="preserve"> periodically — it writes a timestamped, consistent</w:t>
+      </w:r>
+    </w:p>
+    <w:p>
+      <w:r>
+        <w:t xml:space="preserve">copy to </w:t>
+      </w:r>
+      <w:r>
+        <w:rPr>
+          <w:rFonts w:ascii="Consolas" w:hAnsi="Consolas"/>
+          <w:sz w:val="18"/>
+        </w:rPr>
+        <w:t>OneDrive\CMA_Backups\</w:t>
+      </w:r>
+      <w:r>
+        <w:t xml:space="preserve"> (so it syncs off the laptop) and keeps the</w:t>
+      </w:r>
+    </w:p>
+    <w:p>
+      <w:r>
+        <w:t xml:space="preserve">latest 14. Pass </w:t>
+      </w:r>
+      <w:r>
+        <w:rPr>
+          <w:rFonts w:ascii="Consolas" w:hAnsi="Consolas"/>
+          <w:sz w:val="18"/>
+        </w:rPr>
+        <w:t>--to "&lt;folder&gt;"</w:t>
+      </w:r>
+      <w:r>
+        <w:t xml:space="preserve"> for a different destination. To restore,</w:t>
+      </w:r>
+    </w:p>
+    <w:p>
+      <w:r>
+        <w:t xml:space="preserve">copy a </w:t>
+      </w:r>
+      <w:r>
+        <w:rPr>
+          <w:rFonts w:ascii="Consolas" w:hAnsi="Consolas"/>
+          <w:sz w:val="18"/>
+        </w:rPr>
+        <w:t>cma_*.sqlite</w:t>
+      </w:r>
+      <w:r>
+        <w:t xml:space="preserve"> file back to </w:t>
       </w:r>
       <w:r>
         <w:rPr>
@@ -1779,12 +1843,7 @@
         <w:t>db\cma.sqlite</w:t>
       </w:r>
       <w:r>
-        <w:t xml:space="preserve"> if you want to preserve recorded registry checks</w:t>
-      </w:r>
-    </w:p>
-    <w:p>
-      <w:r>
-        <w:t>and news history; everything else regenerates from the exports.</w:t>
+        <w:t>.</w:t>
       </w:r>
     </w:p>
     <w:p>
@@ -1839,6 +1898,8 @@
         <w:t xml:space="preserve">                                     sales_growth current_ratio tol_tnw dso</w:t>
         <w:br/>
         <w:t>cma.py autorun [--no-committee]      watched folders -&gt; credit memo (one shot)</w:t>
+        <w:br/>
+        <w:t>cma.py backup [--to FOLDER]          copy the database to OneDrive (timestamped)</w:t>
         <w:br/>
         <w:t>cma.py probe REPORT.pdf -b NAME      import a Probe42 company report (MCA check)</w:t>
         <w:br/>

</xml_diff>